<commit_message>
qa(guide-00): requalify legacy publication and release audit
</commit_message>
<xml_diff>
--- a/00-foundation-guide/publication-candidate/Lifelong_Opportunity_Foundation_Guide_es-419_v1.1.docx
+++ b/00-foundation-guide/publication-candidate/Lifelong_Opportunity_Foundation_Guide_es-419_v1.1.docx
@@ -2100,7 +2100,7 @@
       </w:r>
     </w:p>
     <w:bookmarkEnd w:id="53"/>
-    <w:bookmarkStart w:id="55" w:name="X9c19812ee9b0987accf3bf41fae5cc7a7f829ab"/>
+    <w:bookmarkStart w:id="83" w:name="X9c19812ee9b0987accf3bf41fae5cc7a7f829ab"/>
     <w:p>
       <w:pPr>
         <w:pStyle w:val="Heading1"/>
@@ -2141,7 +2141,7 @@
         <w:t xml:space="preserve">Una guía solo está lista para publicación después de superar revisiones factual, ética, editorial, de accesibilidad, enlaces, traducción, DOCX, PDF buscable, páginas renderizadas, metadatos y revisión del propietario.</w:t>
       </w:r>
     </w:p>
-    <w:bookmarkStart w:id="54" w:name="fuentes-oficiales-iniciales"/>
+    <w:bookmarkStart w:id="82" w:name="fuentes-oficiales-iniciales"/>
     <w:p>
       <w:pPr>
         <w:pStyle w:val="Heading2"/>
@@ -2276,9 +2276,486 @@
         <w:t xml:space="preserve">2 de agosto de 2026.</w:t>
       </w:r>
     </w:p>
-    <w:bookmarkEnd w:id="54"/>
-    <w:bookmarkEnd w:id="55"/>
-    <w:bookmarkStart w:id="56" w:name="un-siguiente-paso-honesto"/>
+    <w:bookmarkStart w:id="81" w:name="Xcf8a059dd265a15a3184bc707a6ce3803067536"/>
+    <w:p>
+      <w:pPr>
+        <w:pStyle w:val="Heading3"/>
+      </w:pPr>
+      <w:r>
+        <w:t xml:space="preserve">Enlaces oficiales citados — índice consolidado</w:t>
+      </w:r>
+    </w:p>
+    <w:p>
+      <w:pPr>
+        <w:pStyle w:val="FirstParagraph"/>
+      </w:pPr>
+      <w:r>
+        <w:t xml:space="preserve">Los siguientes enlaces oficiales se conservan para mantener paridad de fuentes con la edición inglesa controlada:</w:t>
+      </w:r>
+    </w:p>
+    <w:p>
+      <w:pPr>
+        <w:numPr>
+          <w:ilvl w:val="0"/>
+          <w:numId w:val="1017"/>
+        </w:numPr>
+        <w:pStyle w:val="Compact"/>
+      </w:pPr>
+      <w:hyperlink r:id="rId54">
+        <w:r>
+          <w:rPr>
+            <w:rStyle w:val="Hyperlink"/>
+          </w:rPr>
+          <w:t xml:space="preserve">https://www.jovenesconstruyendoelfuturo.stps.gob.mx/aprendiz</w:t>
+        </w:r>
+      </w:hyperlink>
+    </w:p>
+    <w:p>
+      <w:pPr>
+        <w:numPr>
+          <w:ilvl w:val="0"/>
+          <w:numId w:val="1017"/>
+        </w:numPr>
+        <w:pStyle w:val="Compact"/>
+      </w:pPr>
+      <w:hyperlink r:id="rId55">
+        <w:r>
+          <w:rPr>
+            <w:rStyle w:val="Hyperlink"/>
+          </w:rPr>
+          <w:t xml:space="preserve">https://red-seal.ca/eng/about/program.shtml</w:t>
+        </w:r>
+      </w:hyperlink>
+    </w:p>
+    <w:p>
+      <w:pPr>
+        <w:numPr>
+          <w:ilvl w:val="0"/>
+          <w:numId w:val="1017"/>
+        </w:numPr>
+        <w:pStyle w:val="Compact"/>
+      </w:pPr>
+      <w:hyperlink r:id="rId56">
+        <w:r>
+          <w:rPr>
+            <w:rStyle w:val="Hyperlink"/>
+          </w:rPr>
+          <w:t xml:space="preserve">https://rsa.ed.gov/</w:t>
+        </w:r>
+      </w:hyperlink>
+    </w:p>
+    <w:p>
+      <w:pPr>
+        <w:numPr>
+          <w:ilvl w:val="0"/>
+          <w:numId w:val="1017"/>
+        </w:numPr>
+        <w:pStyle w:val="Compact"/>
+      </w:pPr>
+      <w:hyperlink r:id="rId57">
+        <w:r>
+          <w:rPr>
+            <w:rStyle w:val="Hyperlink"/>
+          </w:rPr>
+          <w:t xml:space="preserve">https://snies.mineducacion.gov.co/portal/</w:t>
+        </w:r>
+      </w:hyperlink>
+    </w:p>
+    <w:p>
+      <w:pPr>
+        <w:numPr>
+          <w:ilvl w:val="0"/>
+          <w:numId w:val="1017"/>
+        </w:numPr>
+        <w:pStyle w:val="Compact"/>
+      </w:pPr>
+      <w:hyperlink r:id="rId58">
+        <w:r>
+          <w:rPr>
+            <w:rStyle w:val="Hyperlink"/>
+          </w:rPr>
+          <w:t xml:space="preserve">https://studentaid.gov/</w:t>
+        </w:r>
+      </w:hyperlink>
+    </w:p>
+    <w:p>
+      <w:pPr>
+        <w:numPr>
+          <w:ilvl w:val="0"/>
+          <w:numId w:val="1017"/>
+        </w:numPr>
+        <w:pStyle w:val="Compact"/>
+      </w:pPr>
+      <w:hyperlink r:id="rId59">
+        <w:r>
+          <w:rPr>
+            <w:rStyle w:val="Hyperlink"/>
+          </w:rPr>
+          <w:t xml:space="preserve">https://web.icetex.gov.co/portal</w:t>
+        </w:r>
+      </w:hyperlink>
+    </w:p>
+    <w:p>
+      <w:pPr>
+        <w:numPr>
+          <w:ilvl w:val="0"/>
+          <w:numId w:val="1017"/>
+        </w:numPr>
+        <w:pStyle w:val="Compact"/>
+      </w:pPr>
+      <w:hyperlink r:id="rId60">
+        <w:r>
+          <w:rPr>
+            <w:rStyle w:val="Hyperlink"/>
+          </w:rPr>
+          <w:t xml:space="preserve">https://www.apprenticeship.gov/career-seekers</w:t>
+        </w:r>
+      </w:hyperlink>
+    </w:p>
+    <w:p>
+      <w:pPr>
+        <w:numPr>
+          <w:ilvl w:val="0"/>
+          <w:numId w:val="1017"/>
+        </w:numPr>
+        <w:pStyle w:val="Compact"/>
+      </w:pPr>
+      <w:hyperlink r:id="rId61">
+        <w:r>
+          <w:rPr>
+            <w:rStyle w:val="Hyperlink"/>
+          </w:rPr>
+          <w:t xml:space="preserve">https://www.apprenticeship.gov/finder/listings</w:t>
+        </w:r>
+      </w:hyperlink>
+    </w:p>
+    <w:p>
+      <w:pPr>
+        <w:numPr>
+          <w:ilvl w:val="0"/>
+          <w:numId w:val="1017"/>
+        </w:numPr>
+        <w:pStyle w:val="Compact"/>
+      </w:pPr>
+      <w:hyperlink r:id="rId62">
+        <w:r>
+          <w:rPr>
+            <w:rStyle w:val="Hyperlink"/>
+          </w:rPr>
+          <w:t xml:space="preserve">https://www.argentina.gob.ar/educacion/progresar/requisitos</w:t>
+        </w:r>
+      </w:hyperlink>
+    </w:p>
+    <w:p>
+      <w:pPr>
+        <w:numPr>
+          <w:ilvl w:val="0"/>
+          <w:numId w:val="1017"/>
+        </w:numPr>
+        <w:pStyle w:val="Compact"/>
+      </w:pPr>
+      <w:hyperlink r:id="rId63">
+        <w:r>
+          <w:rPr>
+            <w:rStyle w:val="Hyperlink"/>
+          </w:rPr>
+          <w:t xml:space="preserve">https://www.argentina.gob.ar/servicio/inscribirme-en-progresar-trabajo</w:t>
+        </w:r>
+      </w:hyperlink>
+    </w:p>
+    <w:p>
+      <w:pPr>
+        <w:numPr>
+          <w:ilvl w:val="0"/>
+          <w:numId w:val="1017"/>
+        </w:numPr>
+        <w:pStyle w:val="Compact"/>
+      </w:pPr>
+      <w:hyperlink r:id="rId64">
+        <w:r>
+          <w:rPr>
+            <w:rStyle w:val="Hyperlink"/>
+          </w:rPr>
+          <w:t xml:space="preserve">https://www.canada.ca/en/services/benefits/education/student-aid.html</w:t>
+        </w:r>
+      </w:hyperlink>
+    </w:p>
+    <w:p>
+      <w:pPr>
+        <w:numPr>
+          <w:ilvl w:val="0"/>
+          <w:numId w:val="1017"/>
+        </w:numPr>
+        <w:pStyle w:val="Compact"/>
+      </w:pPr>
+      <w:hyperlink r:id="rId65">
+        <w:r>
+          <w:rPr>
+            <w:rStyle w:val="Hyperlink"/>
+          </w:rPr>
+          <w:t xml:space="preserve">https://www.canada.ca/en/services/jobs/training/support-skilled-trades-apprentices.html</w:t>
+        </w:r>
+      </w:hyperlink>
+    </w:p>
+    <w:p>
+      <w:pPr>
+        <w:numPr>
+          <w:ilvl w:val="0"/>
+          <w:numId w:val="1017"/>
+        </w:numPr>
+        <w:pStyle w:val="Compact"/>
+      </w:pPr>
+      <w:hyperlink r:id="rId66">
+        <w:r>
+          <w:rPr>
+            <w:rStyle w:val="Hyperlink"/>
+          </w:rPr>
+          <w:t xml:space="preserve">https://www.canada.ca/en/services/jobs/training/support-skilled-trades-apprentices/ei-apprentices.html</w:t>
+        </w:r>
+      </w:hyperlink>
+    </w:p>
+    <w:p>
+      <w:pPr>
+        <w:numPr>
+          <w:ilvl w:val="0"/>
+          <w:numId w:val="1017"/>
+        </w:numPr>
+        <w:pStyle w:val="Compact"/>
+      </w:pPr>
+      <w:hyperlink r:id="rId67">
+        <w:r>
+          <w:rPr>
+            <w:rStyle w:val="Hyperlink"/>
+          </w:rPr>
+          <w:t xml:space="preserve">https://www.canada.ca/en/services/jobs/training/support-skilled-trades-apprentices/loan.html</w:t>
+        </w:r>
+      </w:hyperlink>
+    </w:p>
+    <w:p>
+      <w:pPr>
+        <w:numPr>
+          <w:ilvl w:val="0"/>
+          <w:numId w:val="1017"/>
+        </w:numPr>
+        <w:pStyle w:val="Compact"/>
+      </w:pPr>
+      <w:hyperlink r:id="rId68">
+        <w:r>
+          <w:rPr>
+            <w:rStyle w:val="Hyperlink"/>
+          </w:rPr>
+          <w:t xml:space="preserve">https://www.careeronestop.org/</w:t>
+        </w:r>
+      </w:hyperlink>
+    </w:p>
+    <w:p>
+      <w:pPr>
+        <w:numPr>
+          <w:ilvl w:val="0"/>
+          <w:numId w:val="1017"/>
+        </w:numPr>
+        <w:pStyle w:val="Compact"/>
+      </w:pPr>
+      <w:hyperlink r:id="rId69">
+        <w:r>
+          <w:rPr>
+            <w:rStyle w:val="Hyperlink"/>
+          </w:rPr>
+          <w:t xml:space="preserve">https://www.chileatiende.gob.cl/fichas/20814-programa-becas-fondo-cesantia-solidario</w:t>
+        </w:r>
+      </w:hyperlink>
+    </w:p>
+    <w:p>
+      <w:pPr>
+        <w:numPr>
+          <w:ilvl w:val="0"/>
+          <w:numId w:val="1017"/>
+        </w:numPr>
+        <w:pStyle w:val="Compact"/>
+      </w:pPr>
+      <w:hyperlink r:id="rId70">
+        <w:r>
+          <w:rPr>
+            <w:rStyle w:val="Hyperlink"/>
+          </w:rPr>
+          <w:t xml:space="preserve">https://www.fns.usda.gov/snap-et</w:t>
+        </w:r>
+      </w:hyperlink>
+    </w:p>
+    <w:p>
+      <w:pPr>
+        <w:numPr>
+          <w:ilvl w:val="0"/>
+          <w:numId w:val="1017"/>
+        </w:numPr>
+        <w:pStyle w:val="Compact"/>
+      </w:pPr>
+      <w:hyperlink r:id="rId71">
+        <w:r>
+          <w:rPr>
+            <w:rStyle w:val="Hyperlink"/>
+          </w:rPr>
+          <w:t xml:space="preserve">https://www.gov.br/mec/pt-br/assuntos/es/prouni/prouni</w:t>
+        </w:r>
+      </w:hyperlink>
+    </w:p>
+    <w:p>
+      <w:pPr>
+        <w:numPr>
+          <w:ilvl w:val="0"/>
+          <w:numId w:val="1017"/>
+        </w:numPr>
+        <w:pStyle w:val="Compact"/>
+      </w:pPr>
+      <w:hyperlink r:id="rId72">
+        <w:r>
+          <w:rPr>
+            <w:rStyle w:val="Hyperlink"/>
+          </w:rPr>
+          <w:t xml:space="preserve">https://www.gov.br/pt-br/servicos/inscrever-em-curso-do-caminho-digital</w:t>
+        </w:r>
+      </w:hyperlink>
+    </w:p>
+    <w:p>
+      <w:pPr>
+        <w:numPr>
+          <w:ilvl w:val="0"/>
+          <w:numId w:val="1017"/>
+        </w:numPr>
+        <w:pStyle w:val="Compact"/>
+      </w:pPr>
+      <w:hyperlink r:id="rId73">
+        <w:r>
+          <w:rPr>
+            <w:rStyle w:val="Hyperlink"/>
+          </w:rPr>
+          <w:t xml:space="preserve">https://www.gov.br/pt-br/servicos/inscrever-se-no-sisu-sistema-de-selecao-unificada</w:t>
+        </w:r>
+      </w:hyperlink>
+    </w:p>
+    <w:p>
+      <w:pPr>
+        <w:numPr>
+          <w:ilvl w:val="0"/>
+          <w:numId w:val="1017"/>
+        </w:numPr>
+        <w:pStyle w:val="Compact"/>
+      </w:pPr>
+      <w:hyperlink r:id="rId74">
+        <w:r>
+          <w:rPr>
+            <w:rStyle w:val="Hyperlink"/>
+          </w:rPr>
+          <w:t xml:space="preserve">https://www.gov.br/pt-br/servicos/obter-financiamento-do-fies</w:t>
+        </w:r>
+      </w:hyperlink>
+    </w:p>
+    <w:p>
+      <w:pPr>
+        <w:numPr>
+          <w:ilvl w:val="0"/>
+          <w:numId w:val="1017"/>
+        </w:numPr>
+        <w:pStyle w:val="Compact"/>
+      </w:pPr>
+      <w:hyperlink r:id="rId75">
+        <w:r>
+          <w:rPr>
+            <w:rStyle w:val="Hyperlink"/>
+          </w:rPr>
+          <w:t xml:space="preserve">https://www.gov.br/trabalho-e-emprego/pt-br/assuntos/aprendizagem-profissional</w:t>
+        </w:r>
+      </w:hyperlink>
+    </w:p>
+    <w:p>
+      <w:pPr>
+        <w:numPr>
+          <w:ilvl w:val="0"/>
+          <w:numId w:val="1017"/>
+        </w:numPr>
+        <w:pStyle w:val="Compact"/>
+      </w:pPr>
+      <w:hyperlink r:id="rId76">
+        <w:r>
+          <w:rPr>
+            <w:rStyle w:val="Hyperlink"/>
+          </w:rPr>
+          <w:t xml:space="preserve">https://www.gov.br/trabalho-e-emprego/pt-br/servicos/trabalhador/qualificacao-profissional</w:t>
+        </w:r>
+      </w:hyperlink>
+    </w:p>
+    <w:p>
+      <w:pPr>
+        <w:numPr>
+          <w:ilvl w:val="0"/>
+          <w:numId w:val="1017"/>
+        </w:numPr>
+        <w:pStyle w:val="Compact"/>
+      </w:pPr>
+      <w:hyperlink r:id="rId77">
+        <w:r>
+          <w:rPr>
+            <w:rStyle w:val="Hyperlink"/>
+          </w:rPr>
+          <w:t xml:space="preserve">https://www.jobbank.gc.ca/</w:t>
+        </w:r>
+      </w:hyperlink>
+    </w:p>
+    <w:p>
+      <w:pPr>
+        <w:numPr>
+          <w:ilvl w:val="0"/>
+          <w:numId w:val="1017"/>
+        </w:numPr>
+        <w:pStyle w:val="Compact"/>
+      </w:pPr>
+      <w:hyperlink r:id="rId78">
+        <w:r>
+          <w:rPr>
+            <w:rStyle w:val="Hyperlink"/>
+          </w:rPr>
+          <w:t xml:space="preserve">https://www.jovenesconstruyendoelfuturo.stps.gob.mx/</w:t>
+        </w:r>
+      </w:hyperlink>
+    </w:p>
+    <w:p>
+      <w:pPr>
+        <w:numPr>
+          <w:ilvl w:val="0"/>
+          <w:numId w:val="1017"/>
+        </w:numPr>
+        <w:pStyle w:val="Compact"/>
+      </w:pPr>
+      <w:hyperlink r:id="rId79">
+        <w:r>
+          <w:rPr>
+            <w:rStyle w:val="Hyperlink"/>
+          </w:rPr>
+          <w:t xml:space="preserve">https://www.sena.edu.co/es-co/formacion/Paginas/acceder-cursos.aspx</w:t>
+        </w:r>
+      </w:hyperlink>
+    </w:p>
+    <w:p>
+      <w:pPr>
+        <w:numPr>
+          <w:ilvl w:val="0"/>
+          <w:numId w:val="1017"/>
+        </w:numPr>
+        <w:pStyle w:val="Compact"/>
+      </w:pPr>
+      <w:hyperlink r:id="rId80">
+        <w:r>
+          <w:rPr>
+            <w:rStyle w:val="Hyperlink"/>
+          </w:rPr>
+          <w:t xml:space="preserve">https://www.serviciodeempleo.gov.co/</w:t>
+        </w:r>
+      </w:hyperlink>
+    </w:p>
+    <w:bookmarkEnd w:id="81"/>
+    <w:bookmarkEnd w:id="82"/>
+    <w:bookmarkEnd w:id="83"/>
+    <w:bookmarkStart w:id="84" w:name="un-siguiente-paso-honesto"/>
     <w:p>
       <w:pPr>
         <w:pStyle w:val="Heading1"/>
@@ -2311,7 +2788,7 @@
         <w:t xml:space="preserve">Sin importar su edad, discapacidad, ingreso, ubicación o educación previa, su capacidad de aprender y contribuir merece respeto.</w:t>
       </w:r>
     </w:p>
-    <w:bookmarkEnd w:id="56"/>
+    <w:bookmarkEnd w:id="84"/>
     <w:sectPr/>
   </w:body>
 </w:document>
@@ -2736,6 +3213,9 @@
     </w:lvlOverride>
   </w:num>
   <w:num w:numId="1016">
+    <w:abstractNumId w:val="991"/>
+  </w:num>
+  <w:num w:numId="1017">
     <w:abstractNumId w:val="991"/>
   </w:num>
 </w:numbering>

</xml_diff>